<commit_message>
Updated code for Azure Data Factory pipeline
</commit_message>
<xml_diff>
--- a/docs/Technical details.docx
+++ b/docs/Technical details.docx
@@ -22,6 +22,10 @@
     <w:p>
       <w:pPr>
         <w:pStyle w:val="paragraph"/>
+        <w:numPr>
+          <w:ilvl w:val="0"/>
+          <w:numId w:val="2"/>
+        </w:numPr>
         <w:spacing w:before="0" w:beforeAutospacing="0" w:after="0" w:afterAutospacing="0"/>
         <w:textAlignment w:val="baseline"/>
         <w:rPr>
@@ -42,6 +46,10 @@
     <w:p>
       <w:pPr>
         <w:pStyle w:val="paragraph"/>
+        <w:numPr>
+          <w:ilvl w:val="0"/>
+          <w:numId w:val="3"/>
+        </w:numPr>
         <w:spacing w:before="0" w:beforeAutospacing="0" w:after="0" w:afterAutospacing="0"/>
         <w:textAlignment w:val="baseline"/>
         <w:rPr>
@@ -62,6 +70,10 @@
     <w:p>
       <w:pPr>
         <w:pStyle w:val="paragraph"/>
+        <w:numPr>
+          <w:ilvl w:val="0"/>
+          <w:numId w:val="3"/>
+        </w:numPr>
         <w:spacing w:before="0" w:beforeAutospacing="0" w:after="0" w:afterAutospacing="0"/>
         <w:textAlignment w:val="baseline"/>
         <w:rPr>
@@ -82,6 +94,10 @@
     <w:p>
       <w:pPr>
         <w:pStyle w:val="paragraph"/>
+        <w:numPr>
+          <w:ilvl w:val="0"/>
+          <w:numId w:val="3"/>
+        </w:numPr>
         <w:spacing w:before="0" w:beforeAutospacing="0" w:after="0" w:afterAutospacing="0"/>
         <w:textAlignment w:val="baseline"/>
         <w:rPr>
@@ -102,6 +118,10 @@
     <w:p>
       <w:pPr>
         <w:pStyle w:val="paragraph"/>
+        <w:numPr>
+          <w:ilvl w:val="0"/>
+          <w:numId w:val="3"/>
+        </w:numPr>
         <w:spacing w:before="0" w:beforeAutospacing="0" w:after="0" w:afterAutospacing="0"/>
         <w:textAlignment w:val="baseline"/>
         <w:rPr>
@@ -156,6 +176,10 @@
     <w:p>
       <w:pPr>
         <w:pStyle w:val="paragraph"/>
+        <w:numPr>
+          <w:ilvl w:val="0"/>
+          <w:numId w:val="2"/>
+        </w:numPr>
         <w:spacing w:before="0" w:beforeAutospacing="0" w:after="0" w:afterAutospacing="0"/>
         <w:textAlignment w:val="baseline"/>
         <w:rPr>
@@ -176,6 +200,10 @@
     <w:p>
       <w:pPr>
         <w:pStyle w:val="paragraph"/>
+        <w:numPr>
+          <w:ilvl w:val="0"/>
+          <w:numId w:val="4"/>
+        </w:numPr>
         <w:spacing w:before="0" w:beforeAutospacing="0" w:after="0" w:afterAutospacing="0"/>
         <w:textAlignment w:val="baseline"/>
         <w:rPr>
@@ -196,15 +224,18 @@
     <w:p>
       <w:pPr>
         <w:pStyle w:val="paragraph"/>
-        <w:spacing w:before="0" w:beforeAutospacing="0" w:after="0" w:afterAutospacing="0"/>
-        <w:textAlignment w:val="baseline"/>
-        <w:rPr>
-          <w:rFonts w:ascii="Segoe UI" w:hAnsi="Segoe UI" w:cs="Segoe UI"/>
-          <w:sz w:val="20"/>
-          <w:szCs w:val="20"/>
-        </w:rPr>
-      </w:pPr>
-      <w:proofErr w:type="gramStart"/>
+        <w:numPr>
+          <w:ilvl w:val="1"/>
+          <w:numId w:val="4"/>
+        </w:numPr>
+        <w:spacing w:before="0" w:beforeAutospacing="0" w:after="0" w:afterAutospacing="0"/>
+        <w:textAlignment w:val="baseline"/>
+        <w:rPr>
+          <w:rFonts w:ascii="Segoe UI" w:hAnsi="Segoe UI" w:cs="Segoe UI"/>
+          <w:sz w:val="20"/>
+          <w:szCs w:val="20"/>
+        </w:rPr>
+      </w:pPr>
       <w:r>
         <w:rPr>
           <w:rFonts w:ascii="Segoe UI" w:hAnsi="Segoe UI" w:cs="Segoe UI"/>
@@ -213,20 +244,22 @@
         </w:rPr>
         <w:t>raw</w:t>
       </w:r>
-      <w:proofErr w:type="gramEnd"/>
-    </w:p>
-    <w:p>
-      <w:pPr>
-        <w:pStyle w:val="paragraph"/>
-        <w:spacing w:before="0" w:beforeAutospacing="0" w:after="0" w:afterAutospacing="0"/>
-        <w:textAlignment w:val="baseline"/>
-        <w:rPr>
-          <w:rFonts w:ascii="Segoe UI" w:hAnsi="Segoe UI" w:cs="Segoe UI"/>
-          <w:sz w:val="20"/>
-          <w:szCs w:val="20"/>
-        </w:rPr>
-      </w:pPr>
-      <w:proofErr w:type="gramStart"/>
+    </w:p>
+    <w:p>
+      <w:pPr>
+        <w:pStyle w:val="paragraph"/>
+        <w:numPr>
+          <w:ilvl w:val="1"/>
+          <w:numId w:val="4"/>
+        </w:numPr>
+        <w:spacing w:before="0" w:beforeAutospacing="0" w:after="0" w:afterAutospacing="0"/>
+        <w:textAlignment w:val="baseline"/>
+        <w:rPr>
+          <w:rFonts w:ascii="Segoe UI" w:hAnsi="Segoe UI" w:cs="Segoe UI"/>
+          <w:sz w:val="20"/>
+          <w:szCs w:val="20"/>
+        </w:rPr>
+      </w:pPr>
       <w:r>
         <w:rPr>
           <w:rFonts w:ascii="Segoe UI" w:hAnsi="Segoe UI" w:cs="Segoe UI"/>
@@ -235,20 +268,22 @@
         </w:rPr>
         <w:t>lookup</w:t>
       </w:r>
-      <w:proofErr w:type="gramEnd"/>
-    </w:p>
-    <w:p>
-      <w:pPr>
-        <w:pStyle w:val="paragraph"/>
-        <w:spacing w:before="0" w:beforeAutospacing="0" w:after="0" w:afterAutospacing="0"/>
-        <w:textAlignment w:val="baseline"/>
-        <w:rPr>
-          <w:rFonts w:ascii="Segoe UI" w:hAnsi="Segoe UI" w:cs="Segoe UI"/>
-          <w:sz w:val="20"/>
-          <w:szCs w:val="20"/>
-        </w:rPr>
-      </w:pPr>
-      <w:proofErr w:type="gramStart"/>
+    </w:p>
+    <w:p>
+      <w:pPr>
+        <w:pStyle w:val="paragraph"/>
+        <w:numPr>
+          <w:ilvl w:val="1"/>
+          <w:numId w:val="4"/>
+        </w:numPr>
+        <w:spacing w:before="0" w:beforeAutospacing="0" w:after="0" w:afterAutospacing="0"/>
+        <w:textAlignment w:val="baseline"/>
+        <w:rPr>
+          <w:rFonts w:ascii="Segoe UI" w:hAnsi="Segoe UI" w:cs="Segoe UI"/>
+          <w:sz w:val="20"/>
+          <w:szCs w:val="20"/>
+        </w:rPr>
+      </w:pPr>
       <w:r>
         <w:rPr>
           <w:rFonts w:ascii="Segoe UI" w:hAnsi="Segoe UI" w:cs="Segoe UI"/>
@@ -257,23 +292,27 @@
         </w:rPr>
         <w:t>processed</w:t>
       </w:r>
-      <w:proofErr w:type="gramEnd"/>
-    </w:p>
-    <w:p>
-      <w:pPr>
-        <w:pStyle w:val="paragraph"/>
-        <w:spacing w:before="0" w:beforeAutospacing="0" w:after="0" w:afterAutospacing="0"/>
-        <w:textAlignment w:val="baseline"/>
-        <w:rPr>
-          <w:rFonts w:ascii="Segoe UI" w:hAnsi="Segoe UI" w:cs="Segoe UI"/>
-          <w:sz w:val="20"/>
-          <w:szCs w:val="20"/>
-        </w:rPr>
-      </w:pPr>
-    </w:p>
-    <w:p>
-      <w:pPr>
-        <w:pStyle w:val="paragraph"/>
+    </w:p>
+    <w:p>
+      <w:pPr>
+        <w:pStyle w:val="paragraph"/>
+        <w:spacing w:before="0" w:beforeAutospacing="0" w:after="0" w:afterAutospacing="0"/>
+        <w:ind w:left="720"/>
+        <w:textAlignment w:val="baseline"/>
+        <w:rPr>
+          <w:rFonts w:ascii="Segoe UI" w:hAnsi="Segoe UI" w:cs="Segoe UI"/>
+          <w:sz w:val="20"/>
+          <w:szCs w:val="20"/>
+        </w:rPr>
+      </w:pPr>
+    </w:p>
+    <w:p>
+      <w:pPr>
+        <w:pStyle w:val="paragraph"/>
+        <w:numPr>
+          <w:ilvl w:val="0"/>
+          <w:numId w:val="4"/>
+        </w:numPr>
         <w:spacing w:before="0" w:beforeAutospacing="0" w:after="0" w:afterAutospacing="0"/>
         <w:textAlignment w:val="baseline"/>
         <w:rPr>
@@ -294,15 +333,18 @@
     <w:p>
       <w:pPr>
         <w:pStyle w:val="paragraph"/>
-        <w:spacing w:before="0" w:beforeAutospacing="0" w:after="0" w:afterAutospacing="0"/>
-        <w:textAlignment w:val="baseline"/>
-        <w:rPr>
-          <w:rFonts w:ascii="Segoe UI" w:hAnsi="Segoe UI" w:cs="Segoe UI"/>
-          <w:sz w:val="20"/>
-          <w:szCs w:val="20"/>
-        </w:rPr>
-      </w:pPr>
-      <w:proofErr w:type="gramStart"/>
+        <w:numPr>
+          <w:ilvl w:val="1"/>
+          <w:numId w:val="4"/>
+        </w:numPr>
+        <w:spacing w:before="0" w:beforeAutospacing="0" w:after="0" w:afterAutospacing="0"/>
+        <w:textAlignment w:val="baseline"/>
+        <w:rPr>
+          <w:rFonts w:ascii="Segoe UI" w:hAnsi="Segoe UI" w:cs="Segoe UI"/>
+          <w:sz w:val="20"/>
+          <w:szCs w:val="20"/>
+        </w:rPr>
+      </w:pPr>
       <w:r>
         <w:rPr>
           <w:rFonts w:ascii="Segoe UI" w:hAnsi="Segoe UI" w:cs="Segoe UI"/>
@@ -311,11 +353,14 @@
         </w:rPr>
         <w:t>population</w:t>
       </w:r>
-      <w:proofErr w:type="gramEnd"/>
-    </w:p>
-    <w:p>
-      <w:pPr>
-        <w:pStyle w:val="paragraph"/>
+    </w:p>
+    <w:p>
+      <w:pPr>
+        <w:pStyle w:val="paragraph"/>
+        <w:numPr>
+          <w:ilvl w:val="1"/>
+          <w:numId w:val="4"/>
+        </w:numPr>
         <w:spacing w:before="0" w:beforeAutospacing="0" w:after="0" w:afterAutospacing="0"/>
         <w:textAlignment w:val="baseline"/>
         <w:rPr>
@@ -325,7 +370,6 @@
         </w:rPr>
       </w:pPr>
       <w:proofErr w:type="spellStart"/>
-      <w:proofErr w:type="gramStart"/>
       <w:r>
         <w:rPr>
           <w:rFonts w:ascii="Segoe UI" w:hAnsi="Segoe UI" w:cs="Segoe UI"/>
@@ -335,23 +379,26 @@
         <w:t>config</w:t>
       </w:r>
       <w:proofErr w:type="spellEnd"/>
-      <w:proofErr w:type="gramEnd"/>
-    </w:p>
-    <w:p>
-      <w:pPr>
-        <w:pStyle w:val="paragraph"/>
-        <w:spacing w:before="0" w:beforeAutospacing="0" w:after="0" w:afterAutospacing="0"/>
-        <w:textAlignment w:val="baseline"/>
-        <w:rPr>
-          <w:rFonts w:ascii="Segoe UI" w:hAnsi="Segoe UI" w:cs="Segoe UI"/>
-          <w:sz w:val="20"/>
-          <w:szCs w:val="20"/>
-        </w:rPr>
-      </w:pPr>
-    </w:p>
-    <w:p>
-      <w:pPr>
-        <w:pStyle w:val="paragraph"/>
+    </w:p>
+    <w:p>
+      <w:pPr>
+        <w:pStyle w:val="paragraph"/>
+        <w:spacing w:before="0" w:beforeAutospacing="0" w:after="0" w:afterAutospacing="0"/>
+        <w:textAlignment w:val="baseline"/>
+        <w:rPr>
+          <w:rFonts w:ascii="Segoe UI" w:hAnsi="Segoe UI" w:cs="Segoe UI"/>
+          <w:sz w:val="20"/>
+          <w:szCs w:val="20"/>
+        </w:rPr>
+      </w:pPr>
+    </w:p>
+    <w:p>
+      <w:pPr>
+        <w:pStyle w:val="paragraph"/>
+        <w:numPr>
+          <w:ilvl w:val="0"/>
+          <w:numId w:val="2"/>
+        </w:numPr>
         <w:spacing w:before="0" w:beforeAutospacing="0" w:after="0" w:afterAutospacing="0"/>
         <w:textAlignment w:val="baseline"/>
         <w:rPr>
@@ -384,6 +431,10 @@
     <w:p>
       <w:pPr>
         <w:pStyle w:val="paragraph"/>
+        <w:numPr>
+          <w:ilvl w:val="0"/>
+          <w:numId w:val="5"/>
+        </w:numPr>
         <w:spacing w:before="0" w:beforeAutospacing="0" w:after="0" w:afterAutospacing="0"/>
         <w:textAlignment w:val="baseline"/>
         <w:rPr>
@@ -404,6 +455,34 @@
     <w:p>
       <w:pPr>
         <w:pStyle w:val="paragraph"/>
+        <w:numPr>
+          <w:ilvl w:val="1"/>
+          <w:numId w:val="5"/>
+        </w:numPr>
+        <w:spacing w:before="0" w:beforeAutospacing="0" w:after="0" w:afterAutospacing="0"/>
+        <w:textAlignment w:val="baseline"/>
+        <w:rPr>
+          <w:rFonts w:ascii="Segoe UI" w:hAnsi="Segoe UI" w:cs="Segoe UI"/>
+          <w:sz w:val="20"/>
+          <w:szCs w:val="20"/>
+        </w:rPr>
+      </w:pPr>
+      <w:r>
+        <w:rPr>
+          <w:rFonts w:ascii="Segoe UI" w:hAnsi="Segoe UI" w:cs="Segoe UI"/>
+          <w:sz w:val="20"/>
+          <w:szCs w:val="20"/>
+        </w:rPr>
+        <w:t>Input format -</w:t>
+      </w:r>
+    </w:p>
+    <w:p>
+      <w:pPr>
+        <w:pStyle w:val="paragraph"/>
+        <w:numPr>
+          <w:ilvl w:val="1"/>
+          <w:numId w:val="5"/>
+        </w:numPr>
         <w:spacing w:before="0" w:beforeAutospacing="0" w:after="0" w:afterAutospacing="0"/>
         <w:textAlignment w:val="baseline"/>
         <w:rPr>
@@ -424,6 +503,10 @@
     <w:p>
       <w:pPr>
         <w:pStyle w:val="paragraph"/>
+        <w:numPr>
+          <w:ilvl w:val="1"/>
+          <w:numId w:val="5"/>
+        </w:numPr>
         <w:spacing w:before="0" w:beforeAutospacing="0" w:after="0" w:afterAutospacing="0"/>
         <w:textAlignment w:val="baseline"/>
         <w:rPr>
@@ -446,8 +529,228 @@
           <w:sz w:val="20"/>
           <w:szCs w:val="20"/>
         </w:rPr>
-        <w:t xml:space="preserve"> format - </w:t>
-      </w:r>
+        <w:t xml:space="preserve"> format -</w:t>
+      </w:r>
+    </w:p>
+    <w:p>
+      <w:pPr>
+        <w:pStyle w:val="paragraph"/>
+        <w:numPr>
+          <w:ilvl w:val="1"/>
+          <w:numId w:val="5"/>
+        </w:numPr>
+        <w:spacing w:before="0" w:beforeAutospacing="0" w:after="0" w:afterAutospacing="0"/>
+        <w:textAlignment w:val="baseline"/>
+        <w:rPr>
+          <w:rFonts w:ascii="Segoe UI" w:hAnsi="Segoe UI" w:cs="Segoe UI"/>
+          <w:sz w:val="20"/>
+          <w:szCs w:val="20"/>
+        </w:rPr>
+      </w:pPr>
+      <w:r>
+        <w:rPr>
+          <w:rFonts w:ascii="Segoe UI" w:hAnsi="Segoe UI" w:cs="Segoe UI"/>
+          <w:sz w:val="20"/>
+          <w:szCs w:val="20"/>
+        </w:rPr>
+        <w:t>Output location -</w:t>
+      </w:r>
+    </w:p>
+    <w:p>
+      <w:pPr>
+        <w:pStyle w:val="paragraph"/>
+        <w:numPr>
+          <w:ilvl w:val="1"/>
+          <w:numId w:val="5"/>
+        </w:numPr>
+        <w:spacing w:before="0" w:beforeAutospacing="0" w:after="0" w:afterAutospacing="0"/>
+        <w:textAlignment w:val="baseline"/>
+        <w:rPr>
+          <w:rFonts w:ascii="Segoe UI" w:hAnsi="Segoe UI" w:cs="Segoe UI"/>
+          <w:sz w:val="20"/>
+          <w:szCs w:val="20"/>
+        </w:rPr>
+      </w:pPr>
+      <w:r>
+        <w:rPr>
+          <w:rFonts w:ascii="Segoe UI" w:hAnsi="Segoe UI" w:cs="Segoe UI"/>
+          <w:sz w:val="20"/>
+          <w:szCs w:val="20"/>
+        </w:rPr>
+        <w:t>Ingestion Condition - Only if file has 100 rows</w:t>
+      </w:r>
+    </w:p>
+    <w:p>
+      <w:pPr>
+        <w:pStyle w:val="paragraph"/>
+        <w:numPr>
+          <w:ilvl w:val="1"/>
+          <w:numId w:val="5"/>
+        </w:numPr>
+        <w:spacing w:before="0" w:beforeAutospacing="0" w:after="0" w:afterAutospacing="0"/>
+        <w:textAlignment w:val="baseline"/>
+        <w:rPr>
+          <w:rFonts w:ascii="Segoe UI" w:hAnsi="Segoe UI" w:cs="Segoe UI"/>
+          <w:sz w:val="20"/>
+          <w:szCs w:val="20"/>
+        </w:rPr>
+      </w:pPr>
+      <w:r>
+        <w:rPr>
+          <w:rFonts w:ascii="Segoe UI" w:hAnsi="Segoe UI" w:cs="Segoe UI"/>
+          <w:sz w:val="20"/>
+          <w:szCs w:val="20"/>
+        </w:rPr>
+        <w:t>Ingestion - as soon as file arrives</w:t>
+      </w:r>
+    </w:p>
+    <w:p>
+      <w:pPr>
+        <w:pStyle w:val="paragraph"/>
+        <w:numPr>
+          <w:ilvl w:val="2"/>
+          <w:numId w:val="5"/>
+        </w:numPr>
+        <w:spacing w:before="0" w:beforeAutospacing="0" w:after="0" w:afterAutospacing="0"/>
+        <w:textAlignment w:val="baseline"/>
+        <w:rPr>
+          <w:rFonts w:ascii="Segoe UI" w:hAnsi="Segoe UI" w:cs="Segoe UI"/>
+          <w:sz w:val="20"/>
+          <w:szCs w:val="20"/>
+        </w:rPr>
+      </w:pPr>
+      <w:r>
+        <w:rPr>
+          <w:rFonts w:ascii="Segoe UI" w:hAnsi="Segoe UI" w:cs="Segoe UI"/>
+          <w:sz w:val="20"/>
+          <w:szCs w:val="20"/>
+        </w:rPr>
+        <w:t>Trigger</w:t>
+      </w:r>
+    </w:p>
+    <w:p>
+      <w:pPr>
+        <w:pStyle w:val="paragraph"/>
+        <w:numPr>
+          <w:ilvl w:val="1"/>
+          <w:numId w:val="5"/>
+        </w:numPr>
+        <w:spacing w:before="0" w:beforeAutospacing="0" w:after="0" w:afterAutospacing="0"/>
+        <w:textAlignment w:val="baseline"/>
+        <w:rPr>
+          <w:rFonts w:ascii="Segoe UI" w:hAnsi="Segoe UI" w:cs="Segoe UI"/>
+          <w:sz w:val="20"/>
+          <w:szCs w:val="20"/>
+        </w:rPr>
+      </w:pPr>
+      <w:r>
+        <w:rPr>
+          <w:rFonts w:ascii="Segoe UI" w:hAnsi="Segoe UI" w:cs="Segoe UI"/>
+          <w:sz w:val="20"/>
+          <w:szCs w:val="20"/>
+        </w:rPr>
+        <w:t>Delete the file</w:t>
+      </w:r>
+      <w:r>
+        <w:rPr>
+          <w:rFonts w:ascii="Segoe UI" w:hAnsi="Segoe UI" w:cs="Segoe UI"/>
+          <w:sz w:val="20"/>
+          <w:szCs w:val="20"/>
+        </w:rPr>
+        <w:t xml:space="preserve"> after ingestion</w:t>
+      </w:r>
+    </w:p>
+    <w:p>
+      <w:pPr>
+        <w:pStyle w:val="paragraph"/>
+        <w:numPr>
+          <w:ilvl w:val="1"/>
+          <w:numId w:val="5"/>
+        </w:numPr>
+        <w:spacing w:before="0" w:beforeAutospacing="0" w:after="0" w:afterAutospacing="0"/>
+        <w:textAlignment w:val="baseline"/>
+        <w:rPr>
+          <w:rFonts w:ascii="Segoe UI" w:hAnsi="Segoe UI" w:cs="Segoe UI"/>
+          <w:sz w:val="20"/>
+          <w:szCs w:val="20"/>
+        </w:rPr>
+      </w:pPr>
+    </w:p>
+    <w:p>
+      <w:pPr>
+        <w:pStyle w:val="paragraph"/>
+        <w:spacing w:before="0" w:beforeAutospacing="0" w:after="0" w:afterAutospacing="0"/>
+        <w:textAlignment w:val="baseline"/>
+        <w:rPr>
+          <w:rFonts w:ascii="Segoe UI" w:hAnsi="Segoe UI" w:cs="Segoe UI"/>
+          <w:sz w:val="20"/>
+          <w:szCs w:val="20"/>
+        </w:rPr>
+      </w:pPr>
+    </w:p>
+    <w:p>
+      <w:pPr>
+        <w:pStyle w:val="paragraph"/>
+        <w:numPr>
+          <w:ilvl w:val="0"/>
+          <w:numId w:val="5"/>
+        </w:numPr>
+        <w:spacing w:before="0" w:beforeAutospacing="0" w:after="0" w:afterAutospacing="0"/>
+        <w:textAlignment w:val="baseline"/>
+        <w:rPr>
+          <w:rFonts w:ascii="Segoe UI" w:hAnsi="Segoe UI" w:cs="Segoe UI"/>
+          <w:sz w:val="20"/>
+          <w:szCs w:val="20"/>
+        </w:rPr>
+      </w:pPr>
+      <w:r>
+        <w:rPr>
+          <w:rFonts w:ascii="Segoe UI" w:hAnsi="Segoe UI" w:cs="Segoe UI"/>
+          <w:sz w:val="20"/>
+          <w:szCs w:val="20"/>
+        </w:rPr>
+        <w:t>Covid-19 Data</w:t>
+      </w:r>
+    </w:p>
+    <w:p>
+      <w:pPr>
+        <w:pStyle w:val="paragraph"/>
+        <w:numPr>
+          <w:ilvl w:val="1"/>
+          <w:numId w:val="5"/>
+        </w:numPr>
+        <w:spacing w:before="0" w:beforeAutospacing="0" w:after="0" w:afterAutospacing="0"/>
+        <w:textAlignment w:val="baseline"/>
+        <w:rPr>
+          <w:rFonts w:ascii="Segoe UI" w:hAnsi="Segoe UI" w:cs="Segoe UI"/>
+          <w:sz w:val="20"/>
+          <w:szCs w:val="20"/>
+        </w:rPr>
+      </w:pPr>
+      <w:r>
+        <w:rPr>
+          <w:rFonts w:ascii="Segoe UI" w:hAnsi="Segoe UI" w:cs="Segoe UI"/>
+          <w:sz w:val="20"/>
+          <w:szCs w:val="20"/>
+        </w:rPr>
+        <w:t>Location- blob config</w:t>
+      </w:r>
+    </w:p>
+    <w:p>
+      <w:pPr>
+        <w:pStyle w:val="paragraph"/>
+        <w:numPr>
+          <w:ilvl w:val="1"/>
+          <w:numId w:val="5"/>
+        </w:numPr>
+        <w:spacing w:before="0" w:beforeAutospacing="0" w:after="0" w:afterAutospacing="0"/>
+        <w:textAlignment w:val="baseline"/>
+        <w:rPr>
+          <w:rFonts w:ascii="Segoe UI" w:hAnsi="Segoe UI" w:cs="Segoe UI"/>
+          <w:sz w:val="20"/>
+          <w:szCs w:val="20"/>
+        </w:rPr>
+      </w:pPr>
       <w:proofErr w:type="spellStart"/>
       <w:r>
         <w:rPr>
@@ -455,105 +758,25 @@
           <w:sz w:val="20"/>
           <w:szCs w:val="20"/>
         </w:rPr>
-        <w:t>tcv</w:t>
+        <w:t>j</w:t>
+      </w:r>
+      <w:r>
+        <w:rPr>
+          <w:rFonts w:ascii="Segoe UI" w:hAnsi="Segoe UI" w:cs="Segoe UI"/>
+          <w:sz w:val="20"/>
+          <w:szCs w:val="20"/>
+        </w:rPr>
+        <w:t>son</w:t>
       </w:r>
       <w:proofErr w:type="spellEnd"/>
-    </w:p>
-    <w:p>
-      <w:pPr>
-        <w:pStyle w:val="paragraph"/>
-        <w:spacing w:before="0" w:beforeAutospacing="0" w:after="0" w:afterAutospacing="0"/>
-        <w:textAlignment w:val="baseline"/>
-        <w:rPr>
-          <w:rFonts w:ascii="Segoe UI" w:hAnsi="Segoe UI" w:cs="Segoe UI"/>
-          <w:sz w:val="20"/>
-          <w:szCs w:val="20"/>
-        </w:rPr>
-      </w:pPr>
-      <w:r>
-        <w:rPr>
-          <w:rFonts w:ascii="Segoe UI" w:hAnsi="Segoe UI" w:cs="Segoe UI"/>
-          <w:sz w:val="20"/>
-          <w:szCs w:val="20"/>
-        </w:rPr>
-        <w:t xml:space="preserve">Output location - </w:t>
-      </w:r>
-    </w:p>
-    <w:p>
-      <w:pPr>
-        <w:pStyle w:val="paragraph"/>
-        <w:spacing w:before="0" w:beforeAutospacing="0" w:after="0" w:afterAutospacing="0"/>
-        <w:textAlignment w:val="baseline"/>
-        <w:rPr>
-          <w:rFonts w:ascii="Segoe UI" w:hAnsi="Segoe UI" w:cs="Segoe UI"/>
-          <w:sz w:val="20"/>
-          <w:szCs w:val="20"/>
-        </w:rPr>
-      </w:pPr>
-    </w:p>
-    <w:p>
-      <w:pPr>
-        <w:pStyle w:val="paragraph"/>
-        <w:spacing w:before="0" w:beforeAutospacing="0" w:after="0" w:afterAutospacing="0"/>
-        <w:textAlignment w:val="baseline"/>
-        <w:rPr>
-          <w:rFonts w:ascii="Segoe UI" w:hAnsi="Segoe UI" w:cs="Segoe UI"/>
-          <w:sz w:val="20"/>
-          <w:szCs w:val="20"/>
-        </w:rPr>
-      </w:pPr>
-      <w:r>
-        <w:rPr>
-          <w:rFonts w:ascii="Segoe UI" w:hAnsi="Segoe UI" w:cs="Segoe UI"/>
-          <w:sz w:val="20"/>
-          <w:szCs w:val="20"/>
-        </w:rPr>
-        <w:t>File need to be deleted after ingestion</w:t>
-      </w:r>
-    </w:p>
-    <w:p>
-      <w:pPr>
-        <w:pStyle w:val="paragraph"/>
-        <w:spacing w:before="0" w:beforeAutospacing="0" w:after="0" w:afterAutospacing="0"/>
-        <w:textAlignment w:val="baseline"/>
-        <w:rPr>
-          <w:rFonts w:ascii="Segoe UI" w:hAnsi="Segoe UI" w:cs="Segoe UI"/>
-          <w:sz w:val="20"/>
-          <w:szCs w:val="20"/>
-        </w:rPr>
-      </w:pPr>
-    </w:p>
-    <w:p>
-      <w:pPr>
-        <w:pStyle w:val="paragraph"/>
-        <w:spacing w:before="0" w:beforeAutospacing="0" w:after="0" w:afterAutospacing="0"/>
-        <w:textAlignment w:val="baseline"/>
-        <w:rPr>
-          <w:rFonts w:ascii="Segoe UI" w:hAnsi="Segoe UI" w:cs="Segoe UI"/>
-          <w:sz w:val="20"/>
-          <w:szCs w:val="20"/>
-        </w:rPr>
-      </w:pPr>
-      <w:r>
-        <w:rPr>
-          <w:rFonts w:ascii="Segoe UI" w:hAnsi="Segoe UI" w:cs="Segoe UI"/>
-          <w:sz w:val="20"/>
-          <w:szCs w:val="20"/>
-        </w:rPr>
-        <w:t>Covid-19 Data</w:t>
-      </w:r>
-    </w:p>
-    <w:p>
-      <w:pPr>
-        <w:pStyle w:val="paragraph"/>
-        <w:spacing w:before="0" w:beforeAutospacing="0" w:after="0" w:afterAutospacing="0"/>
-        <w:textAlignment w:val="baseline"/>
-        <w:rPr>
-          <w:rFonts w:ascii="Segoe UI" w:hAnsi="Segoe UI" w:cs="Segoe UI"/>
-          <w:sz w:val="20"/>
-          <w:szCs w:val="20"/>
-        </w:rPr>
-      </w:pPr>
+      <w:r>
+        <w:rPr>
+          <w:rFonts w:ascii="Segoe UI" w:hAnsi="Segoe UI" w:cs="Segoe UI"/>
+          <w:sz w:val="20"/>
+          <w:szCs w:val="20"/>
+        </w:rPr>
+        <w:t xml:space="preserve"> </w:t>
+      </w:r>
       <w:proofErr w:type="spellStart"/>
       <w:r>
         <w:rPr>
@@ -561,7 +784,7 @@
           <w:sz w:val="20"/>
           <w:szCs w:val="20"/>
         </w:rPr>
-        <w:t>Json</w:t>
+        <w:t>config</w:t>
       </w:r>
       <w:proofErr w:type="spellEnd"/>
       <w:r>
@@ -572,24 +795,6 @@
         </w:rPr>
         <w:t xml:space="preserve"> </w:t>
       </w:r>
-      <w:proofErr w:type="spellStart"/>
-      <w:r>
-        <w:rPr>
-          <w:rFonts w:ascii="Segoe UI" w:hAnsi="Segoe UI" w:cs="Segoe UI"/>
-          <w:sz w:val="20"/>
-          <w:szCs w:val="20"/>
-        </w:rPr>
-        <w:t>config</w:t>
-      </w:r>
-      <w:proofErr w:type="spellEnd"/>
-      <w:r>
-        <w:rPr>
-          <w:rFonts w:ascii="Segoe UI" w:hAnsi="Segoe UI" w:cs="Segoe UI"/>
-          <w:sz w:val="20"/>
-          <w:szCs w:val="20"/>
-        </w:rPr>
-        <w:t xml:space="preserve"> </w:t>
-      </w:r>
       <w:r>
         <w:rPr>
           <w:rFonts w:ascii="Segoe UI" w:hAnsi="Segoe UI" w:cs="Segoe UI"/>
@@ -602,6 +807,10 @@
     <w:p>
       <w:pPr>
         <w:pStyle w:val="paragraph"/>
+        <w:numPr>
+          <w:ilvl w:val="2"/>
+          <w:numId w:val="5"/>
+        </w:numPr>
         <w:spacing w:before="0" w:beforeAutospacing="0" w:after="0" w:afterAutospacing="0"/>
         <w:textAlignment w:val="baseline"/>
         <w:rPr>
@@ -622,6 +831,10 @@
     <w:p>
       <w:pPr>
         <w:pStyle w:val="paragraph"/>
+        <w:numPr>
+          <w:ilvl w:val="2"/>
+          <w:numId w:val="5"/>
+        </w:numPr>
         <w:spacing w:before="0" w:beforeAutospacing="0" w:after="0" w:afterAutospacing="0"/>
         <w:textAlignment w:val="baseline"/>
         <w:rPr>
@@ -642,6 +855,10 @@
     <w:p>
       <w:pPr>
         <w:pStyle w:val="paragraph"/>
+        <w:numPr>
+          <w:ilvl w:val="2"/>
+          <w:numId w:val="5"/>
+        </w:numPr>
         <w:spacing w:before="0" w:beforeAutospacing="0" w:after="0" w:afterAutospacing="0"/>
         <w:textAlignment w:val="baseline"/>
         <w:rPr>
@@ -666,31 +883,288 @@
         <w:textAlignment w:val="baseline"/>
         <w:rPr>
           <w:rFonts w:ascii="Segoe UI" w:hAnsi="Segoe UI" w:cs="Segoe UI"/>
-        </w:rPr>
-      </w:pPr>
-    </w:p>
-    <w:p>
-      <w:pPr>
-        <w:pStyle w:val="paragraph"/>
-        <w:spacing w:before="0" w:beforeAutospacing="0" w:after="0" w:afterAutospacing="0"/>
-        <w:textAlignment w:val="baseline"/>
-        <w:rPr>
-          <w:rFonts w:ascii="Segoe UI" w:hAnsi="Segoe UI" w:cs="Segoe UI"/>
-        </w:rPr>
-      </w:pPr>
-      <w:r>
-        <w:rPr>
-          <w:rFonts w:ascii="Segoe UI" w:hAnsi="Segoe UI" w:cs="Segoe UI"/>
+          <w:sz w:val="20"/>
+          <w:szCs w:val="20"/>
+        </w:rPr>
+      </w:pPr>
+    </w:p>
+    <w:p>
+      <w:pPr>
+        <w:pStyle w:val="paragraph"/>
+        <w:numPr>
+          <w:ilvl w:val="1"/>
+          <w:numId w:val="5"/>
+        </w:numPr>
+        <w:spacing w:before="0" w:beforeAutospacing="0" w:after="0" w:afterAutospacing="0"/>
+        <w:textAlignment w:val="baseline"/>
+        <w:rPr>
+          <w:rFonts w:ascii="Segoe UI" w:hAnsi="Segoe UI" w:cs="Segoe UI"/>
+          <w:sz w:val="20"/>
+          <w:szCs w:val="20"/>
+        </w:rPr>
+      </w:pPr>
+      <w:r>
+        <w:rPr>
+          <w:rFonts w:ascii="Segoe UI" w:hAnsi="Segoe UI" w:cs="Segoe UI"/>
+          <w:sz w:val="20"/>
+          <w:szCs w:val="20"/>
+        </w:rPr>
+        <w:t>Scheduled - Daily at mid night</w:t>
+      </w:r>
+    </w:p>
+    <w:p>
+      <w:pPr>
+        <w:pStyle w:val="paragraph"/>
+        <w:numPr>
+          <w:ilvl w:val="1"/>
+          <w:numId w:val="5"/>
+        </w:numPr>
+        <w:spacing w:before="0" w:beforeAutospacing="0" w:after="0" w:afterAutospacing="0"/>
+        <w:textAlignment w:val="baseline"/>
+        <w:rPr>
+          <w:rFonts w:ascii="Segoe UI" w:hAnsi="Segoe UI" w:cs="Segoe UI"/>
+          <w:sz w:val="20"/>
+          <w:szCs w:val="20"/>
+        </w:rPr>
+      </w:pPr>
+      <w:r>
+        <w:rPr>
+          <w:rFonts w:ascii="Segoe UI" w:hAnsi="Segoe UI" w:cs="Segoe UI"/>
+          <w:sz w:val="20"/>
+          <w:szCs w:val="20"/>
+        </w:rPr>
+        <w:t xml:space="preserve">Output format - </w:t>
+      </w:r>
+    </w:p>
+    <w:p>
+      <w:pPr>
+        <w:pStyle w:val="paragraph"/>
+        <w:spacing w:before="0" w:beforeAutospacing="0" w:after="0" w:afterAutospacing="0"/>
+        <w:ind w:left="720"/>
+        <w:textAlignment w:val="baseline"/>
+        <w:rPr>
+          <w:rFonts w:ascii="Segoe UI" w:hAnsi="Segoe UI" w:cs="Segoe UI"/>
+          <w:sz w:val="20"/>
+          <w:szCs w:val="20"/>
+        </w:rPr>
+      </w:pPr>
+    </w:p>
+    <w:p>
+      <w:pPr>
+        <w:pStyle w:val="paragraph"/>
+        <w:numPr>
+          <w:ilvl w:val="0"/>
+          <w:numId w:val="2"/>
+        </w:numPr>
+        <w:spacing w:before="0" w:beforeAutospacing="0" w:after="0" w:afterAutospacing="0"/>
+        <w:textAlignment w:val="baseline"/>
+        <w:rPr>
+          <w:rFonts w:ascii="Segoe UI" w:hAnsi="Segoe UI" w:cs="Segoe UI"/>
+          <w:sz w:val="20"/>
+          <w:szCs w:val="20"/>
+        </w:rPr>
+      </w:pPr>
+      <w:r>
+        <w:rPr>
+          <w:rFonts w:ascii="Segoe UI" w:hAnsi="Segoe UI" w:cs="Segoe UI"/>
+          <w:sz w:val="20"/>
+          <w:szCs w:val="20"/>
         </w:rPr>
         <w:t>Transformation Requirement</w:t>
       </w:r>
     </w:p>
     <w:p>
       <w:pPr>
-        <w:rPr>
-          <w:lang w:val="en-US"/>
-        </w:rPr>
-      </w:pPr>
+        <w:pStyle w:val="paragraph"/>
+        <w:numPr>
+          <w:ilvl w:val="0"/>
+          <w:numId w:val="2"/>
+        </w:numPr>
+        <w:spacing w:before="0" w:beforeAutospacing="0" w:after="0" w:afterAutospacing="0"/>
+        <w:textAlignment w:val="baseline"/>
+        <w:rPr>
+          <w:rFonts w:ascii="Segoe UI" w:hAnsi="Segoe UI" w:cs="Segoe UI"/>
+          <w:sz w:val="20"/>
+          <w:szCs w:val="20"/>
+        </w:rPr>
+      </w:pPr>
+      <w:r>
+        <w:rPr>
+          <w:rFonts w:ascii="Segoe UI" w:hAnsi="Segoe UI" w:cs="Segoe UI"/>
+          <w:sz w:val="20"/>
+          <w:szCs w:val="20"/>
+        </w:rPr>
+        <w:t>SQL BI requirement</w:t>
+      </w:r>
+    </w:p>
+    <w:p>
+      <w:pPr>
+        <w:pStyle w:val="paragraph"/>
+        <w:numPr>
+          <w:ilvl w:val="1"/>
+          <w:numId w:val="2"/>
+        </w:numPr>
+        <w:spacing w:before="0" w:beforeAutospacing="0" w:after="0" w:afterAutospacing="0"/>
+        <w:textAlignment w:val="baseline"/>
+        <w:rPr>
+          <w:rFonts w:ascii="Segoe UI" w:hAnsi="Segoe UI" w:cs="Segoe UI"/>
+          <w:sz w:val="20"/>
+          <w:szCs w:val="20"/>
+        </w:rPr>
+      </w:pPr>
+      <w:r>
+        <w:rPr>
+          <w:rFonts w:ascii="Segoe UI" w:hAnsi="Segoe UI" w:cs="Segoe UI"/>
+          <w:sz w:val="20"/>
+          <w:szCs w:val="20"/>
+        </w:rPr>
+        <w:t xml:space="preserve">Schema </w:t>
+      </w:r>
+    </w:p>
+    <w:p>
+      <w:pPr>
+        <w:pStyle w:val="paragraph"/>
+        <w:numPr>
+          <w:ilvl w:val="2"/>
+          <w:numId w:val="2"/>
+        </w:numPr>
+        <w:spacing w:before="0" w:beforeAutospacing="0" w:after="0" w:afterAutospacing="0"/>
+        <w:textAlignment w:val="baseline"/>
+        <w:rPr>
+          <w:rFonts w:ascii="Segoe UI" w:hAnsi="Segoe UI" w:cs="Segoe UI"/>
+          <w:sz w:val="20"/>
+          <w:szCs w:val="20"/>
+        </w:rPr>
+      </w:pPr>
+      <w:r>
+        <w:rPr>
+          <w:rFonts w:ascii="Segoe UI" w:hAnsi="Segoe UI" w:cs="Segoe UI"/>
+          <w:sz w:val="20"/>
+          <w:szCs w:val="20"/>
+        </w:rPr>
+        <w:t>covid_reporting</w:t>
+      </w:r>
+    </w:p>
+    <w:p>
+      <w:pPr>
+        <w:pStyle w:val="paragraph"/>
+        <w:numPr>
+          <w:ilvl w:val="1"/>
+          <w:numId w:val="2"/>
+        </w:numPr>
+        <w:spacing w:before="0" w:beforeAutospacing="0" w:after="0" w:afterAutospacing="0"/>
+        <w:textAlignment w:val="baseline"/>
+        <w:rPr>
+          <w:rFonts w:ascii="Segoe UI" w:hAnsi="Segoe UI" w:cs="Segoe UI"/>
+          <w:sz w:val="20"/>
+          <w:szCs w:val="20"/>
+        </w:rPr>
+      </w:pPr>
+      <w:r>
+        <w:rPr>
+          <w:rFonts w:ascii="Segoe UI" w:hAnsi="Segoe UI" w:cs="Segoe UI"/>
+          <w:sz w:val="20"/>
+          <w:szCs w:val="20"/>
+        </w:rPr>
+        <w:t xml:space="preserve">Table </w:t>
+      </w:r>
+    </w:p>
+    <w:p>
+      <w:pPr>
+        <w:pStyle w:val="paragraph"/>
+        <w:numPr>
+          <w:ilvl w:val="2"/>
+          <w:numId w:val="2"/>
+        </w:numPr>
+        <w:spacing w:before="0" w:beforeAutospacing="0" w:after="0" w:afterAutospacing="0"/>
+        <w:textAlignment w:val="baseline"/>
+        <w:rPr>
+          <w:rFonts w:ascii="Segoe UI" w:hAnsi="Segoe UI" w:cs="Segoe UI"/>
+          <w:sz w:val="20"/>
+          <w:szCs w:val="20"/>
+        </w:rPr>
+      </w:pPr>
+      <w:r>
+        <w:rPr>
+          <w:rFonts w:ascii="Segoe UI" w:hAnsi="Segoe UI" w:cs="Segoe UI"/>
+          <w:sz w:val="20"/>
+          <w:szCs w:val="20"/>
+        </w:rPr>
+        <w:t>cases_and_deaths</w:t>
+      </w:r>
+    </w:p>
+    <w:p>
+      <w:pPr>
+        <w:pStyle w:val="paragraph"/>
+        <w:numPr>
+          <w:ilvl w:val="2"/>
+          <w:numId w:val="2"/>
+        </w:numPr>
+        <w:spacing w:before="0" w:beforeAutospacing="0" w:after="0" w:afterAutospacing="0"/>
+        <w:textAlignment w:val="baseline"/>
+        <w:rPr>
+          <w:rFonts w:ascii="Segoe UI" w:hAnsi="Segoe UI" w:cs="Segoe UI"/>
+          <w:sz w:val="20"/>
+          <w:szCs w:val="20"/>
+        </w:rPr>
+      </w:pPr>
+      <w:r>
+        <w:rPr>
+          <w:rFonts w:ascii="Segoe UI" w:hAnsi="Segoe UI" w:cs="Segoe UI"/>
+          <w:sz w:val="20"/>
+          <w:szCs w:val="20"/>
+        </w:rPr>
+        <w:lastRenderedPageBreak/>
+        <w:t>hospital_admissions_daily</w:t>
+      </w:r>
+    </w:p>
+    <w:p>
+      <w:pPr>
+        <w:pStyle w:val="paragraph"/>
+        <w:numPr>
+          <w:ilvl w:val="2"/>
+          <w:numId w:val="2"/>
+        </w:numPr>
+        <w:spacing w:before="0" w:beforeAutospacing="0" w:after="0" w:afterAutospacing="0"/>
+        <w:textAlignment w:val="baseline"/>
+        <w:rPr>
+          <w:rFonts w:ascii="Segoe UI" w:hAnsi="Segoe UI" w:cs="Segoe UI"/>
+          <w:sz w:val="20"/>
+          <w:szCs w:val="20"/>
+        </w:rPr>
+      </w:pPr>
+      <w:r>
+        <w:rPr>
+          <w:rFonts w:ascii="Segoe UI" w:hAnsi="Segoe UI" w:cs="Segoe UI"/>
+          <w:sz w:val="20"/>
+          <w:szCs w:val="20"/>
+        </w:rPr>
+        <w:t>testing</w:t>
+      </w:r>
+    </w:p>
+    <w:p>
+      <w:pPr>
+        <w:pStyle w:val="paragraph"/>
+        <w:numPr>
+          <w:ilvl w:val="0"/>
+          <w:numId w:val="2"/>
+        </w:numPr>
+        <w:spacing w:before="0" w:beforeAutospacing="0" w:after="0" w:afterAutospacing="0"/>
+        <w:textAlignment w:val="baseline"/>
+        <w:rPr>
+          <w:rFonts w:ascii="Segoe UI" w:hAnsi="Segoe UI" w:cs="Segoe UI"/>
+          <w:sz w:val="20"/>
+          <w:szCs w:val="20"/>
+        </w:rPr>
+      </w:pPr>
+      <w:r>
+        <w:rPr>
+          <w:rFonts w:ascii="Segoe UI" w:hAnsi="Segoe UI" w:cs="Segoe UI"/>
+          <w:sz w:val="20"/>
+          <w:szCs w:val="20"/>
+        </w:rPr>
+        <w:t>Trigger</w:t>
+      </w:r>
     </w:p>
     <w:sectPr>
       <w:pgSz w:w="12240" w:h="15840"/>
@@ -705,6 +1179,431 @@
 <file path=word/numbering.xml><?xml version="1.0" encoding="utf-8"?>
 <w:numbering xmlns:ve="http://schemas.openxmlformats.org/markup-compatibility/2006" xmlns:o="urn:schemas-microsoft-com:office:office" xmlns:r="http://schemas.openxmlformats.org/officeDocument/2006/relationships" xmlns:m="http://schemas.openxmlformats.org/officeDocument/2006/math" xmlns:v="urn:schemas-microsoft-com:vml" xmlns:wp="http://schemas.openxmlformats.org/drawingml/2006/wordprocessingDrawing" xmlns:w10="urn:schemas-microsoft-com:office:word" xmlns:w="http://schemas.openxmlformats.org/wordprocessingml/2006/main" xmlns:wne="http://schemas.microsoft.com/office/word/2006/wordml">
   <w:abstractNum w:abstractNumId="0">
+    <w:nsid w:val="2B423558"/>
+    <w:multiLevelType w:val="hybridMultilevel"/>
+    <w:tmpl w:val="76840410"/>
+    <w:lvl w:ilvl="0" w:tplc="04090001">
+      <w:start w:val="1"/>
+      <w:numFmt w:val="bullet"/>
+      <w:lvlText w:val=""/>
+      <w:lvlJc w:val="left"/>
+      <w:pPr>
+        <w:ind w:left="1440" w:hanging="360"/>
+      </w:pPr>
+      <w:rPr>
+        <w:rFonts w:ascii="Symbol" w:hAnsi="Symbol" w:hint="default"/>
+      </w:rPr>
+    </w:lvl>
+    <w:lvl w:ilvl="1" w:tplc="04090003">
+      <w:start w:val="1"/>
+      <w:numFmt w:val="bullet"/>
+      <w:lvlText w:val="o"/>
+      <w:lvlJc w:val="left"/>
+      <w:pPr>
+        <w:ind w:left="2160" w:hanging="360"/>
+      </w:pPr>
+      <w:rPr>
+        <w:rFonts w:ascii="Courier New" w:hAnsi="Courier New" w:cs="Courier New" w:hint="default"/>
+      </w:rPr>
+    </w:lvl>
+    <w:lvl w:ilvl="2" w:tplc="04090005" w:tentative="1">
+      <w:start w:val="1"/>
+      <w:numFmt w:val="bullet"/>
+      <w:lvlText w:val=""/>
+      <w:lvlJc w:val="left"/>
+      <w:pPr>
+        <w:ind w:left="2880" w:hanging="360"/>
+      </w:pPr>
+      <w:rPr>
+        <w:rFonts w:ascii="Wingdings" w:hAnsi="Wingdings" w:hint="default"/>
+      </w:rPr>
+    </w:lvl>
+    <w:lvl w:ilvl="3" w:tplc="04090001" w:tentative="1">
+      <w:start w:val="1"/>
+      <w:numFmt w:val="bullet"/>
+      <w:lvlText w:val=""/>
+      <w:lvlJc w:val="left"/>
+      <w:pPr>
+        <w:ind w:left="3600" w:hanging="360"/>
+      </w:pPr>
+      <w:rPr>
+        <w:rFonts w:ascii="Symbol" w:hAnsi="Symbol" w:hint="default"/>
+      </w:rPr>
+    </w:lvl>
+    <w:lvl w:ilvl="4" w:tplc="04090003" w:tentative="1">
+      <w:start w:val="1"/>
+      <w:numFmt w:val="bullet"/>
+      <w:lvlText w:val="o"/>
+      <w:lvlJc w:val="left"/>
+      <w:pPr>
+        <w:ind w:left="4320" w:hanging="360"/>
+      </w:pPr>
+      <w:rPr>
+        <w:rFonts w:ascii="Courier New" w:hAnsi="Courier New" w:cs="Courier New" w:hint="default"/>
+      </w:rPr>
+    </w:lvl>
+    <w:lvl w:ilvl="5" w:tplc="04090005" w:tentative="1">
+      <w:start w:val="1"/>
+      <w:numFmt w:val="bullet"/>
+      <w:lvlText w:val=""/>
+      <w:lvlJc w:val="left"/>
+      <w:pPr>
+        <w:ind w:left="5040" w:hanging="360"/>
+      </w:pPr>
+      <w:rPr>
+        <w:rFonts w:ascii="Wingdings" w:hAnsi="Wingdings" w:hint="default"/>
+      </w:rPr>
+    </w:lvl>
+    <w:lvl w:ilvl="6" w:tplc="04090001" w:tentative="1">
+      <w:start w:val="1"/>
+      <w:numFmt w:val="bullet"/>
+      <w:lvlText w:val=""/>
+      <w:lvlJc w:val="left"/>
+      <w:pPr>
+        <w:ind w:left="5760" w:hanging="360"/>
+      </w:pPr>
+      <w:rPr>
+        <w:rFonts w:ascii="Symbol" w:hAnsi="Symbol" w:hint="default"/>
+      </w:rPr>
+    </w:lvl>
+    <w:lvl w:ilvl="7" w:tplc="04090003" w:tentative="1">
+      <w:start w:val="1"/>
+      <w:numFmt w:val="bullet"/>
+      <w:lvlText w:val="o"/>
+      <w:lvlJc w:val="left"/>
+      <w:pPr>
+        <w:ind w:left="6480" w:hanging="360"/>
+      </w:pPr>
+      <w:rPr>
+        <w:rFonts w:ascii="Courier New" w:hAnsi="Courier New" w:cs="Courier New" w:hint="default"/>
+      </w:rPr>
+    </w:lvl>
+    <w:lvl w:ilvl="8" w:tplc="04090005" w:tentative="1">
+      <w:start w:val="1"/>
+      <w:numFmt w:val="bullet"/>
+      <w:lvlText w:val=""/>
+      <w:lvlJc w:val="left"/>
+      <w:pPr>
+        <w:ind w:left="7200" w:hanging="360"/>
+      </w:pPr>
+      <w:rPr>
+        <w:rFonts w:ascii="Wingdings" w:hAnsi="Wingdings" w:hint="default"/>
+      </w:rPr>
+    </w:lvl>
+  </w:abstractNum>
+  <w:abstractNum w:abstractNumId="1">
+    <w:nsid w:val="2C0A389F"/>
+    <w:multiLevelType w:val="hybridMultilevel"/>
+    <w:tmpl w:val="F59CFD84"/>
+    <w:lvl w:ilvl="0" w:tplc="04090001">
+      <w:start w:val="1"/>
+      <w:numFmt w:val="bullet"/>
+      <w:lvlText w:val=""/>
+      <w:lvlJc w:val="left"/>
+      <w:pPr>
+        <w:ind w:left="1080" w:hanging="360"/>
+      </w:pPr>
+      <w:rPr>
+        <w:rFonts w:ascii="Symbol" w:hAnsi="Symbol" w:hint="default"/>
+      </w:rPr>
+    </w:lvl>
+    <w:lvl w:ilvl="1" w:tplc="04090003" w:tentative="1">
+      <w:start w:val="1"/>
+      <w:numFmt w:val="bullet"/>
+      <w:lvlText w:val="o"/>
+      <w:lvlJc w:val="left"/>
+      <w:pPr>
+        <w:ind w:left="1800" w:hanging="360"/>
+      </w:pPr>
+      <w:rPr>
+        <w:rFonts w:ascii="Courier New" w:hAnsi="Courier New" w:cs="Courier New" w:hint="default"/>
+      </w:rPr>
+    </w:lvl>
+    <w:lvl w:ilvl="2" w:tplc="04090005" w:tentative="1">
+      <w:start w:val="1"/>
+      <w:numFmt w:val="bullet"/>
+      <w:lvlText w:val=""/>
+      <w:lvlJc w:val="left"/>
+      <w:pPr>
+        <w:ind w:left="2520" w:hanging="360"/>
+      </w:pPr>
+      <w:rPr>
+        <w:rFonts w:ascii="Wingdings" w:hAnsi="Wingdings" w:hint="default"/>
+      </w:rPr>
+    </w:lvl>
+    <w:lvl w:ilvl="3" w:tplc="04090001" w:tentative="1">
+      <w:start w:val="1"/>
+      <w:numFmt w:val="bullet"/>
+      <w:lvlText w:val=""/>
+      <w:lvlJc w:val="left"/>
+      <w:pPr>
+        <w:ind w:left="3240" w:hanging="360"/>
+      </w:pPr>
+      <w:rPr>
+        <w:rFonts w:ascii="Symbol" w:hAnsi="Symbol" w:hint="default"/>
+      </w:rPr>
+    </w:lvl>
+    <w:lvl w:ilvl="4" w:tplc="04090003" w:tentative="1">
+      <w:start w:val="1"/>
+      <w:numFmt w:val="bullet"/>
+      <w:lvlText w:val="o"/>
+      <w:lvlJc w:val="left"/>
+      <w:pPr>
+        <w:ind w:left="3960" w:hanging="360"/>
+      </w:pPr>
+      <w:rPr>
+        <w:rFonts w:ascii="Courier New" w:hAnsi="Courier New" w:cs="Courier New" w:hint="default"/>
+      </w:rPr>
+    </w:lvl>
+    <w:lvl w:ilvl="5" w:tplc="04090005" w:tentative="1">
+      <w:start w:val="1"/>
+      <w:numFmt w:val="bullet"/>
+      <w:lvlText w:val=""/>
+      <w:lvlJc w:val="left"/>
+      <w:pPr>
+        <w:ind w:left="4680" w:hanging="360"/>
+      </w:pPr>
+      <w:rPr>
+        <w:rFonts w:ascii="Wingdings" w:hAnsi="Wingdings" w:hint="default"/>
+      </w:rPr>
+    </w:lvl>
+    <w:lvl w:ilvl="6" w:tplc="04090001" w:tentative="1">
+      <w:start w:val="1"/>
+      <w:numFmt w:val="bullet"/>
+      <w:lvlText w:val=""/>
+      <w:lvlJc w:val="left"/>
+      <w:pPr>
+        <w:ind w:left="5400" w:hanging="360"/>
+      </w:pPr>
+      <w:rPr>
+        <w:rFonts w:ascii="Symbol" w:hAnsi="Symbol" w:hint="default"/>
+      </w:rPr>
+    </w:lvl>
+    <w:lvl w:ilvl="7" w:tplc="04090003" w:tentative="1">
+      <w:start w:val="1"/>
+      <w:numFmt w:val="bullet"/>
+      <w:lvlText w:val="o"/>
+      <w:lvlJc w:val="left"/>
+      <w:pPr>
+        <w:ind w:left="6120" w:hanging="360"/>
+      </w:pPr>
+      <w:rPr>
+        <w:rFonts w:ascii="Courier New" w:hAnsi="Courier New" w:cs="Courier New" w:hint="default"/>
+      </w:rPr>
+    </w:lvl>
+    <w:lvl w:ilvl="8" w:tplc="04090005" w:tentative="1">
+      <w:start w:val="1"/>
+      <w:numFmt w:val="bullet"/>
+      <w:lvlText w:val=""/>
+      <w:lvlJc w:val="left"/>
+      <w:pPr>
+        <w:ind w:left="6840" w:hanging="360"/>
+      </w:pPr>
+      <w:rPr>
+        <w:rFonts w:ascii="Wingdings" w:hAnsi="Wingdings" w:hint="default"/>
+      </w:rPr>
+    </w:lvl>
+  </w:abstractNum>
+  <w:abstractNum w:abstractNumId="2">
+    <w:nsid w:val="52DC15F8"/>
+    <w:multiLevelType w:val="hybridMultilevel"/>
+    <w:tmpl w:val="09A8F3AA"/>
+    <w:lvl w:ilvl="0" w:tplc="04090001">
+      <w:start w:val="1"/>
+      <w:numFmt w:val="bullet"/>
+      <w:lvlText w:val=""/>
+      <w:lvlJc w:val="left"/>
+      <w:pPr>
+        <w:ind w:left="1080" w:hanging="360"/>
+      </w:pPr>
+      <w:rPr>
+        <w:rFonts w:ascii="Symbol" w:hAnsi="Symbol" w:hint="default"/>
+      </w:rPr>
+    </w:lvl>
+    <w:lvl w:ilvl="1" w:tplc="04090003">
+      <w:start w:val="1"/>
+      <w:numFmt w:val="bullet"/>
+      <w:lvlText w:val="o"/>
+      <w:lvlJc w:val="left"/>
+      <w:pPr>
+        <w:ind w:left="1800" w:hanging="360"/>
+      </w:pPr>
+      <w:rPr>
+        <w:rFonts w:ascii="Courier New" w:hAnsi="Courier New" w:cs="Courier New" w:hint="default"/>
+      </w:rPr>
+    </w:lvl>
+    <w:lvl w:ilvl="2" w:tplc="04090005">
+      <w:start w:val="1"/>
+      <w:numFmt w:val="bullet"/>
+      <w:lvlText w:val=""/>
+      <w:lvlJc w:val="left"/>
+      <w:pPr>
+        <w:ind w:left="2520" w:hanging="360"/>
+      </w:pPr>
+      <w:rPr>
+        <w:rFonts w:ascii="Wingdings" w:hAnsi="Wingdings" w:hint="default"/>
+      </w:rPr>
+    </w:lvl>
+    <w:lvl w:ilvl="3" w:tplc="04090001" w:tentative="1">
+      <w:start w:val="1"/>
+      <w:numFmt w:val="bullet"/>
+      <w:lvlText w:val=""/>
+      <w:lvlJc w:val="left"/>
+      <w:pPr>
+        <w:ind w:left="3240" w:hanging="360"/>
+      </w:pPr>
+      <w:rPr>
+        <w:rFonts w:ascii="Symbol" w:hAnsi="Symbol" w:hint="default"/>
+      </w:rPr>
+    </w:lvl>
+    <w:lvl w:ilvl="4" w:tplc="04090003" w:tentative="1">
+      <w:start w:val="1"/>
+      <w:numFmt w:val="bullet"/>
+      <w:lvlText w:val="o"/>
+      <w:lvlJc w:val="left"/>
+      <w:pPr>
+        <w:ind w:left="3960" w:hanging="360"/>
+      </w:pPr>
+      <w:rPr>
+        <w:rFonts w:ascii="Courier New" w:hAnsi="Courier New" w:cs="Courier New" w:hint="default"/>
+      </w:rPr>
+    </w:lvl>
+    <w:lvl w:ilvl="5" w:tplc="04090005" w:tentative="1">
+      <w:start w:val="1"/>
+      <w:numFmt w:val="bullet"/>
+      <w:lvlText w:val=""/>
+      <w:lvlJc w:val="left"/>
+      <w:pPr>
+        <w:ind w:left="4680" w:hanging="360"/>
+      </w:pPr>
+      <w:rPr>
+        <w:rFonts w:ascii="Wingdings" w:hAnsi="Wingdings" w:hint="default"/>
+      </w:rPr>
+    </w:lvl>
+    <w:lvl w:ilvl="6" w:tplc="04090001" w:tentative="1">
+      <w:start w:val="1"/>
+      <w:numFmt w:val="bullet"/>
+      <w:lvlText w:val=""/>
+      <w:lvlJc w:val="left"/>
+      <w:pPr>
+        <w:ind w:left="5400" w:hanging="360"/>
+      </w:pPr>
+      <w:rPr>
+        <w:rFonts w:ascii="Symbol" w:hAnsi="Symbol" w:hint="default"/>
+      </w:rPr>
+    </w:lvl>
+    <w:lvl w:ilvl="7" w:tplc="04090003" w:tentative="1">
+      <w:start w:val="1"/>
+      <w:numFmt w:val="bullet"/>
+      <w:lvlText w:val="o"/>
+      <w:lvlJc w:val="left"/>
+      <w:pPr>
+        <w:ind w:left="6120" w:hanging="360"/>
+      </w:pPr>
+      <w:rPr>
+        <w:rFonts w:ascii="Courier New" w:hAnsi="Courier New" w:cs="Courier New" w:hint="default"/>
+      </w:rPr>
+    </w:lvl>
+    <w:lvl w:ilvl="8" w:tplc="04090005" w:tentative="1">
+      <w:start w:val="1"/>
+      <w:numFmt w:val="bullet"/>
+      <w:lvlText w:val=""/>
+      <w:lvlJc w:val="left"/>
+      <w:pPr>
+        <w:ind w:left="6840" w:hanging="360"/>
+      </w:pPr>
+      <w:rPr>
+        <w:rFonts w:ascii="Wingdings" w:hAnsi="Wingdings" w:hint="default"/>
+      </w:rPr>
+    </w:lvl>
+  </w:abstractNum>
+  <w:abstractNum w:abstractNumId="3">
+    <w:nsid w:val="5F795CC5"/>
+    <w:multiLevelType w:val="hybridMultilevel"/>
+    <w:tmpl w:val="2CCCE234"/>
+    <w:lvl w:ilvl="0" w:tplc="0409000F">
+      <w:start w:val="1"/>
+      <w:numFmt w:val="decimal"/>
+      <w:lvlText w:val="%1."/>
+      <w:lvlJc w:val="left"/>
+      <w:pPr>
+        <w:ind w:left="720" w:hanging="360"/>
+      </w:pPr>
+    </w:lvl>
+    <w:lvl w:ilvl="1" w:tplc="04090019">
+      <w:start w:val="1"/>
+      <w:numFmt w:val="lowerLetter"/>
+      <w:lvlText w:val="%2."/>
+      <w:lvlJc w:val="left"/>
+      <w:pPr>
+        <w:ind w:left="1440" w:hanging="360"/>
+      </w:pPr>
+    </w:lvl>
+    <w:lvl w:ilvl="2" w:tplc="0409001B">
+      <w:start w:val="1"/>
+      <w:numFmt w:val="lowerRoman"/>
+      <w:lvlText w:val="%3."/>
+      <w:lvlJc w:val="right"/>
+      <w:pPr>
+        <w:ind w:left="2160" w:hanging="180"/>
+      </w:pPr>
+    </w:lvl>
+    <w:lvl w:ilvl="3" w:tplc="0409000F" w:tentative="1">
+      <w:start w:val="1"/>
+      <w:numFmt w:val="decimal"/>
+      <w:lvlText w:val="%4."/>
+      <w:lvlJc w:val="left"/>
+      <w:pPr>
+        <w:ind w:left="2880" w:hanging="360"/>
+      </w:pPr>
+    </w:lvl>
+    <w:lvl w:ilvl="4" w:tplc="04090019" w:tentative="1">
+      <w:start w:val="1"/>
+      <w:numFmt w:val="lowerLetter"/>
+      <w:lvlText w:val="%5."/>
+      <w:lvlJc w:val="left"/>
+      <w:pPr>
+        <w:ind w:left="3600" w:hanging="360"/>
+      </w:pPr>
+    </w:lvl>
+    <w:lvl w:ilvl="5" w:tplc="0409001B" w:tentative="1">
+      <w:start w:val="1"/>
+      <w:numFmt w:val="lowerRoman"/>
+      <w:lvlText w:val="%6."/>
+      <w:lvlJc w:val="right"/>
+      <w:pPr>
+        <w:ind w:left="4320" w:hanging="180"/>
+      </w:pPr>
+    </w:lvl>
+    <w:lvl w:ilvl="6" w:tplc="0409000F" w:tentative="1">
+      <w:start w:val="1"/>
+      <w:numFmt w:val="decimal"/>
+      <w:lvlText w:val="%7."/>
+      <w:lvlJc w:val="left"/>
+      <w:pPr>
+        <w:ind w:left="5040" w:hanging="360"/>
+      </w:pPr>
+    </w:lvl>
+    <w:lvl w:ilvl="7" w:tplc="04090019" w:tentative="1">
+      <w:start w:val="1"/>
+      <w:numFmt w:val="lowerLetter"/>
+      <w:lvlText w:val="%8."/>
+      <w:lvlJc w:val="left"/>
+      <w:pPr>
+        <w:ind w:left="5760" w:hanging="360"/>
+      </w:pPr>
+    </w:lvl>
+    <w:lvl w:ilvl="8" w:tplc="0409001B" w:tentative="1">
+      <w:start w:val="1"/>
+      <w:numFmt w:val="lowerRoman"/>
+      <w:lvlText w:val="%9."/>
+      <w:lvlJc w:val="right"/>
+      <w:pPr>
+        <w:ind w:left="6480" w:hanging="180"/>
+      </w:pPr>
+    </w:lvl>
+  </w:abstractNum>
+  <w:abstractNum w:abstractNumId="4">
     <w:nsid w:val="6B1D7CAD"/>
     <w:multiLevelType w:val="hybridMultilevel"/>
     <w:tmpl w:val="AAE47498"/>
@@ -818,7 +1717,19 @@
     </w:lvl>
   </w:abstractNum>
   <w:num w:numId="1">
+    <w:abstractNumId w:val="4"/>
+  </w:num>
+  <w:num w:numId="2">
+    <w:abstractNumId w:val="3"/>
+  </w:num>
+  <w:num w:numId="3">
+    <w:abstractNumId w:val="1"/>
+  </w:num>
+  <w:num w:numId="4">
     <w:abstractNumId w:val="0"/>
+  </w:num>
+  <w:num w:numId="5">
+    <w:abstractNumId w:val="2"/>
   </w:num>
 </w:numbering>
 </file>
@@ -1380,7 +2291,7 @@
   <a:extraClrSchemeLst/>
   <a:extLst>
     <a:ext uri="{05A4C25C-085E-4340-85A3-A5531E510DB2}">
-      <thm15:themeFamily xmlns="" xmlns:thm15="http://schemas.microsoft.com/office/thememl/2012/main" name="Office Theme" id="{62F939B6-93AF-4DB8-9C6B-D6C7DFDC589F}" vid="{4A3C46E8-61CC-4603-A589-7422A47A8E4A}"/>
+      <thm15:themeFamily xmlns:thm15="http://schemas.microsoft.com/office/thememl/2012/main" xmlns="" name="Office Theme" id="{62F939B6-93AF-4DB8-9C6B-D6C7DFDC589F}" vid="{4A3C46E8-61CC-4603-A589-7422A47A8E4A}"/>
     </a:ext>
   </a:extLst>
 </a:theme>

</xml_diff>